<commit_message>
fixed the bug for token limit
</commit_message>
<xml_diff>
--- a/to_do.docx
+++ b/to_do.docx
@@ -8,6 +8,61 @@
       </w:pPr>
     </w:p>
     <w:p>
+      <w:r>
+        <w:t xml:space="preserve">Market cap </w:t>
+      </w:r>
+      <w:r>
+        <w:t>displayed in the last cell of the html does</w:t>
+      </w:r>
+      <w:r>
+        <w:t xml:space="preserve"> not take into account </w:t>
+      </w:r>
+      <w:r>
+        <w:t xml:space="preserve">the outstanding </w:t>
+      </w:r>
+      <w:r>
+        <w:t>pre-funded warrants (refer to TCRX) : why ?</w:t>
+      </w:r>
+      <w:r>
+        <w:t xml:space="preserve"> Check if the outstanding pre-funded warrants are nevertheless taken into account in the </w:t>
+      </w:r>
+      <w:proofErr w:type="spellStart"/>
+      <w:r>
+        <w:t>rNPV</w:t>
+      </w:r>
+      <w:proofErr w:type="spellEnd"/>
+      <w:r>
+        <w:t xml:space="preserve"> valuation and the other results</w:t>
+      </w:r>
+    </w:p>
+    <w:p/>
+    <w:p>
+      <w:r>
+        <w:t>Parse the LLM results and check for parameters which may influence the score which we did not take into account neither in the score nor in the 9 modifiers weights. Propose how to add those in the modifier weights. If I OK, you will modify the html and UI to insert those new modifier weights.</w:t>
+      </w:r>
+    </w:p>
+    <w:p>
+      <w:pPr>
+        <w:rPr>
+          <w:highlight w:val="yellow"/>
+        </w:rPr>
+      </w:pPr>
+    </w:p>
+    <w:p>
+      <w:pPr>
+        <w:rPr>
+          <w:highlight w:val="yellow"/>
+        </w:rPr>
+      </w:pPr>
+    </w:p>
+    <w:p>
+      <w:pPr>
+        <w:rPr>
+          <w:highlight w:val="yellow"/>
+        </w:rPr>
+      </w:pPr>
+    </w:p>
+    <w:p>
       <w:pPr>
         <w:pStyle w:val="ListParagraph"/>
         <w:numPr>
@@ -143,6 +198,7 @@
         <w:t>, zzz, …) .</w:t>
       </w:r>
     </w:p>
+    <w:p/>
     <w:p/>
     <w:p>
       <w:r>
@@ -1804,7 +1860,6 @@
   <w:style w:type="character" w:default="1" w:styleId="DefaultParagraphFont">
     <w:name w:val="Default Paragraph Font"/>
     <w:uiPriority w:val="1"/>
-    <w:semiHidden/>
     <w:unhideWhenUsed/>
   </w:style>
   <w:style w:type="table" w:default="1" w:styleId="TableNormal">

</xml_diff>